<commit_message>
chore: Python 3.10 → 3.13 e regras de ignore do Dependabot
- CI (PYTHON_VERSION) e Dockerfile.python em 3.13 (3.10 perde suporte em
  2026-10-31); limpeza do ensurepip sem versão fixa no caminho
- dependabot.yml: ignora major de Node/ESLint e minor/major de Python
  (troca de runtime é decisão planejada)
- STATUS, SETUP e ROTEIRO atualizados; .docx regenerados

Co-Authored-By: Claude Opus 5.5 <noreply@anthropic.com>
</commit_message>
<xml_diff>
--- a/docs/SETUP_NOVA_MAQUINA.docx
+++ b/docs/SETUP_NOVA_MAQUINA.docx
@@ -481,7 +481,7 @@
               <w:pStyle w:val="Compact"/>
             </w:pPr>
             <w:r>
-              <w:t xml:space="preserve">3.10.x</w:t>
+              <w:t xml:space="preserve">3.13.x</w:t>
             </w:r>
           </w:p>
         </w:tc>
@@ -1025,7 +1025,7 @@
         <w:rPr>
           <w:rStyle w:val="NormalTok"/>
         </w:rPr>
-        <w:t xml:space="preserve"> PYTHONDONTWRITEBYTECODE=1 python:3.10-slim sh </w:t>
+        <w:t xml:space="preserve"> PYTHONDONTWRITEBYTECODE=1 python:3.13-slim sh </w:t>
       </w:r>
       <w:r>
         <w:rPr>

</xml_diff>